<commit_message>
Week 6 Day 2
</commit_message>
<xml_diff>
--- a/week6/loaders functional spec.docx
+++ b/week6/loaders functional spec.docx
@@ -46,6 +46,12 @@
       </w:r>
     </w:p>
     <w:p>
+      <w:pPr>
+        <w:rPr>
+          <w:rFonts w:eastAsia="新細明體"/>
+          <w:lang w:eastAsia="zh-TW"/>
+        </w:rPr>
+      </w:pPr>
       <w:r>
         <w:rPr>
           <w:rFonts w:eastAsia="新細明體" w:hint="eastAsia"/>
@@ -58,20 +64,477 @@
           <w:rFonts w:eastAsia="新細明體"/>
           <w:lang w:eastAsia="zh-TW"/>
         </w:rPr>
+        <w:t xml:space="preserve"> ItemLoader </w:t>
+      </w:r>
+      <w:r>
+        <w:rPr>
+          <w:rFonts w:eastAsia="新細明體" w:hint="eastAsia"/>
+          <w:lang w:eastAsia="zh-TW"/>
+        </w:rPr>
+        <w:t>的類，用於從</w:t>
+      </w:r>
+      <w:r>
+        <w:rPr>
+          <w:rFonts w:eastAsia="新細明體"/>
+          <w:lang w:eastAsia="zh-TW"/>
+        </w:rPr>
+        <w:t xml:space="preserve"> Amazon Reviews </w:t>
+      </w:r>
+      <w:r>
+        <w:rPr>
+          <w:rFonts w:eastAsia="新細明體" w:hint="eastAsia"/>
+          <w:lang w:eastAsia="zh-TW"/>
+        </w:rPr>
+        <w:t>資料集中載入、清洗並轉換原始資料為結構化的</w:t>
+      </w:r>
+      <w:r>
+        <w:rPr>
+          <w:rFonts w:eastAsia="新細明體"/>
+          <w:lang w:eastAsia="zh-TW"/>
+        </w:rPr>
+        <w:t xml:space="preserve"> Item </w:t>
+      </w:r>
+      <w:r>
+        <w:rPr>
+          <w:rFonts w:eastAsia="新細明體" w:hint="eastAsia"/>
+          <w:lang w:eastAsia="zh-TW"/>
+        </w:rPr>
+        <w:t>物件。支援並行處理以提高資料處理效率。</w:t>
+      </w:r>
+    </w:p>
+    <w:p>
+      <w:pPr>
+        <w:spacing w:after="0"/>
+        <w:rPr>
+          <w:rFonts w:eastAsia="新細明體"/>
+          <w:i/>
+          <w:iCs/>
+          <w:lang w:eastAsia="zh-TW"/>
+        </w:rPr>
+      </w:pPr>
+      <w:r>
+        <w:rPr>
+          <w:i/>
+          <w:iCs/>
+        </w:rPr>
+        <w:t>loader = ItemLoader(name="electronics")</w:t>
+      </w:r>
+    </w:p>
+    <w:p>
+      <w:pPr>
+        <w:spacing w:after="0"/>
+        <w:rPr>
+          <w:rFonts w:eastAsia="新細明體"/>
+          <w:i/>
+          <w:iCs/>
+          <w:lang w:eastAsia="zh-TW"/>
+        </w:rPr>
+      </w:pPr>
+      <w:r>
+        <w:rPr>
+          <w:rFonts w:eastAsia="新細明體"/>
+          <w:i/>
+          <w:iCs/>
+          <w:lang w:eastAsia="zh-TW"/>
+        </w:rPr>
+        <w:t>results = loader.load()</w:t>
+      </w:r>
+    </w:p>
+    <w:p>
+      <w:pPr>
+        <w:spacing w:after="0"/>
+        <w:rPr>
+          <w:rFonts w:eastAsia="新細明體"/>
+          <w:i/>
+          <w:iCs/>
+          <w:lang w:eastAsia="zh-TW"/>
+        </w:rPr>
+      </w:pPr>
+    </w:p>
+    <w:p>
+      <w:pPr>
+        <w:spacing w:after="0"/>
+        <w:rPr>
+          <w:rFonts w:eastAsia="新細明體"/>
+          <w:b/>
+          <w:bCs/>
+          <w:i/>
+          <w:iCs/>
+          <w:lang w:eastAsia="zh-TW"/>
+        </w:rPr>
+      </w:pPr>
+      <w:r>
+        <w:rPr>
+          <w:rFonts w:ascii="Segoe UI Emoji" w:eastAsia="新細明體" w:hAnsi="Segoe UI Emoji" w:cs="Segoe UI Emoji"/>
+          <w:b/>
+          <w:bCs/>
+          <w:i/>
+          <w:iCs/>
+          <w:lang w:eastAsia="zh-TW"/>
+        </w:rPr>
+        <w:t>📌</w:t>
+      </w:r>
+      <w:r>
+        <w:rPr>
+          <w:rFonts w:eastAsia="新細明體"/>
+          <w:b/>
+          <w:bCs/>
+          <w:i/>
+          <w:iCs/>
+          <w:lang w:eastAsia="zh-TW"/>
+        </w:rPr>
         <w:t xml:space="preserve"> </w:t>
       </w:r>
-      <w:proofErr w:type="spellStart"/>
-      <w:r>
-        <w:rPr>
-          <w:rFonts w:eastAsia="新細明體"/>
-          <w:lang w:eastAsia="zh-TW"/>
-        </w:rPr>
-        <w:t>ItemLoader</w:t>
-      </w:r>
-      <w:proofErr w:type="spellEnd"/>
-      <w:r>
-        <w:rPr>
-          <w:rFonts w:eastAsia="新細明體"/>
+      <w:r>
+        <w:rPr>
+          <w:rFonts w:eastAsia="新細明體"/>
+          <w:b/>
+          <w:bCs/>
+          <w:i/>
+          <w:iCs/>
+          <w:lang w:eastAsia="zh-TW"/>
+        </w:rPr>
+        <w:t>流程說明：</w:t>
+      </w:r>
+    </w:p>
+    <w:p>
+      <w:pPr>
+        <w:numPr>
+          <w:ilvl w:val="0"/>
+          <w:numId w:val="10"/>
+        </w:numPr>
+        <w:spacing w:after="0"/>
+        <w:rPr>
+          <w:rFonts w:eastAsia="新細明體"/>
+          <w:i/>
+          <w:iCs/>
+          <w:lang w:eastAsia="zh-TW"/>
+        </w:rPr>
+      </w:pPr>
+      <w:r>
+        <w:rPr>
+          <w:rFonts w:eastAsia="新細明體"/>
+          <w:b/>
+          <w:bCs/>
+          <w:i/>
+          <w:iCs/>
+          <w:lang w:eastAsia="zh-TW"/>
+        </w:rPr>
+        <w:t>外部呼叫</w:t>
+      </w:r>
+      <w:r>
+        <w:rPr>
+          <w:rFonts w:eastAsia="新細明體"/>
+          <w:i/>
+          <w:iCs/>
+          <w:lang w:eastAsia="zh-TW"/>
+        </w:rPr>
+        <w:t>：建立</w:t>
+      </w:r>
+      <w:r>
+        <w:rPr>
+          <w:rFonts w:eastAsia="新細明體"/>
+          <w:i/>
+          <w:iCs/>
+          <w:lang w:eastAsia="zh-TW"/>
+        </w:rPr>
+        <w:t xml:space="preserve"> ItemLoader </w:t>
+      </w:r>
+      <w:r>
+        <w:rPr>
+          <w:rFonts w:eastAsia="新細明體"/>
+          <w:i/>
+          <w:iCs/>
+          <w:lang w:eastAsia="zh-TW"/>
+        </w:rPr>
+        <w:t>實例</w:t>
+      </w:r>
+    </w:p>
+    <w:p>
+      <w:pPr>
+        <w:numPr>
+          <w:ilvl w:val="0"/>
+          <w:numId w:val="10"/>
+        </w:numPr>
+        <w:spacing w:after="0"/>
+        <w:rPr>
+          <w:rFonts w:eastAsia="新細明體"/>
+          <w:i/>
+          <w:iCs/>
+          <w:lang w:eastAsia="zh-TW"/>
+        </w:rPr>
+      </w:pPr>
+      <w:r>
+        <w:rPr>
+          <w:rFonts w:eastAsia="新細明體"/>
+          <w:b/>
+          <w:bCs/>
+          <w:i/>
+          <w:iCs/>
+          <w:lang w:eastAsia="zh-TW"/>
+        </w:rPr>
+        <w:t>初始化</w:t>
+      </w:r>
+      <w:r>
+        <w:rPr>
+          <w:rFonts w:eastAsia="新細明體"/>
+          <w:i/>
+          <w:iCs/>
+          <w:lang w:eastAsia="zh-TW"/>
+        </w:rPr>
+        <w:t>：設定類別名稱</w:t>
+      </w:r>
+    </w:p>
+    <w:p>
+      <w:pPr>
+        <w:numPr>
+          <w:ilvl w:val="0"/>
+          <w:numId w:val="10"/>
+        </w:numPr>
+        <w:spacing w:after="0"/>
+        <w:rPr>
+          <w:rFonts w:eastAsia="新細明體"/>
+          <w:i/>
+          <w:iCs/>
+          <w:lang w:eastAsia="zh-TW"/>
+        </w:rPr>
+      </w:pPr>
+      <w:r>
+        <w:rPr>
+          <w:rFonts w:eastAsia="新細明體"/>
+          <w:b/>
+          <w:bCs/>
+          <w:i/>
+          <w:iCs/>
+          <w:lang w:eastAsia="zh-TW"/>
+        </w:rPr>
+        <w:t>load()</w:t>
+      </w:r>
+      <w:r>
+        <w:rPr>
+          <w:rFonts w:eastAsia="新細明體"/>
+          <w:i/>
+          <w:iCs/>
+          <w:lang w:eastAsia="zh-TW"/>
+        </w:rPr>
+        <w:t>：進入主流程，開始載入指定類別的資料集</w:t>
+      </w:r>
+    </w:p>
+    <w:p>
+      <w:pPr>
+        <w:numPr>
+          <w:ilvl w:val="0"/>
+          <w:numId w:val="10"/>
+        </w:numPr>
+        <w:spacing w:after="0"/>
+        <w:rPr>
+          <w:rFonts w:eastAsia="新細明體"/>
+          <w:i/>
+          <w:iCs/>
+          <w:lang w:eastAsia="zh-TW"/>
+        </w:rPr>
+      </w:pPr>
+      <w:r>
+        <w:rPr>
+          <w:rFonts w:eastAsia="新細明體"/>
+          <w:b/>
+          <w:bCs/>
+          <w:i/>
+          <w:iCs/>
+          <w:lang w:eastAsia="zh-TW"/>
+        </w:rPr>
+        <w:t>load_dataset()</w:t>
+      </w:r>
+      <w:r>
+        <w:rPr>
+          <w:rFonts w:eastAsia="新細明體"/>
+          <w:i/>
+          <w:iCs/>
+          <w:lang w:eastAsia="zh-TW"/>
+        </w:rPr>
+        <w:t>：從</w:t>
+      </w:r>
+      <w:r>
+        <w:rPr>
+          <w:rFonts w:eastAsia="新細明體"/>
+          <w:i/>
+          <w:iCs/>
+          <w:lang w:eastAsia="zh-TW"/>
+        </w:rPr>
+        <w:t xml:space="preserve"> Hugging Face </w:t>
+      </w:r>
+      <w:r>
+        <w:rPr>
+          <w:rFonts w:eastAsia="新細明體"/>
+          <w:i/>
+          <w:iCs/>
+          <w:lang w:eastAsia="zh-TW"/>
+        </w:rPr>
+        <w:t>下載原始資料</w:t>
+      </w:r>
+    </w:p>
+    <w:p>
+      <w:pPr>
+        <w:numPr>
+          <w:ilvl w:val="0"/>
+          <w:numId w:val="10"/>
+        </w:numPr>
+        <w:spacing w:after="0"/>
+        <w:rPr>
+          <w:rFonts w:eastAsia="新細明體"/>
+          <w:i/>
+          <w:iCs/>
+          <w:lang w:eastAsia="zh-TW"/>
+        </w:rPr>
+      </w:pPr>
+      <w:r>
+        <w:rPr>
+          <w:rFonts w:eastAsia="新細明體"/>
+          <w:b/>
+          <w:bCs/>
+          <w:i/>
+          <w:iCs/>
+          <w:lang w:eastAsia="zh-TW"/>
+        </w:rPr>
+        <w:t>load_in_parallel()</w:t>
+      </w:r>
+      <w:r>
+        <w:rPr>
+          <w:rFonts w:eastAsia="新細明體"/>
+          <w:i/>
+          <w:iCs/>
+          <w:lang w:eastAsia="zh-TW"/>
+        </w:rPr>
+        <w:t>：進行並行資料處理</w:t>
+      </w:r>
+    </w:p>
+    <w:p>
+      <w:pPr>
+        <w:numPr>
+          <w:ilvl w:val="1"/>
+          <w:numId w:val="11"/>
+        </w:numPr>
+        <w:spacing w:after="0"/>
+        <w:rPr>
+          <w:rFonts w:eastAsia="新細明體"/>
+          <w:i/>
+          <w:iCs/>
+          <w:lang w:eastAsia="zh-TW"/>
+        </w:rPr>
+      </w:pPr>
+      <w:r>
+        <w:rPr>
+          <w:rFonts w:eastAsia="新細明體"/>
+          <w:b/>
+          <w:bCs/>
+          <w:i/>
+          <w:iCs/>
+          <w:lang w:eastAsia="zh-TW"/>
+        </w:rPr>
+        <w:t>chunk_generator()</w:t>
+      </w:r>
+      <w:r>
+        <w:rPr>
+          <w:rFonts w:eastAsia="新細明體"/>
+          <w:i/>
+          <w:iCs/>
+          <w:lang w:eastAsia="zh-TW"/>
+        </w:rPr>
+        <w:t>：將整個資料集切成一塊塊</w:t>
+      </w:r>
+      <w:r>
+        <w:rPr>
+          <w:rFonts w:eastAsia="新細明體"/>
+          <w:i/>
+          <w:iCs/>
+          <w:lang w:eastAsia="zh-TW"/>
+        </w:rPr>
+        <w:t xml:space="preserve"> chunk</w:t>
+      </w:r>
+    </w:p>
+    <w:p>
+      <w:pPr>
+        <w:numPr>
+          <w:ilvl w:val="1"/>
+          <w:numId w:val="11"/>
+        </w:numPr>
+        <w:spacing w:after="0"/>
+        <w:rPr>
+          <w:rFonts w:eastAsia="新細明體"/>
+          <w:i/>
+          <w:iCs/>
+          <w:lang w:eastAsia="zh-TW"/>
+        </w:rPr>
+      </w:pPr>
+      <w:r>
+        <w:rPr>
+          <w:rFonts w:eastAsia="新細明體"/>
+          <w:b/>
+          <w:bCs/>
+          <w:i/>
+          <w:iCs/>
+          <w:lang w:eastAsia="zh-TW"/>
+        </w:rPr>
+        <w:t>from_chunk()</w:t>
+      </w:r>
+      <w:r>
+        <w:rPr>
+          <w:rFonts w:eastAsia="新細明體"/>
+          <w:i/>
+          <w:iCs/>
+          <w:lang w:eastAsia="zh-TW"/>
+        </w:rPr>
+        <w:t>：處理每個</w:t>
+      </w:r>
+      <w:r>
+        <w:rPr>
+          <w:rFonts w:eastAsia="新細明體"/>
+          <w:i/>
+          <w:iCs/>
+          <w:lang w:eastAsia="zh-TW"/>
+        </w:rPr>
+        <w:t xml:space="preserve"> chunk</w:t>
+      </w:r>
+    </w:p>
+    <w:p>
+      <w:pPr>
+        <w:numPr>
+          <w:ilvl w:val="2"/>
+          <w:numId w:val="10"/>
+        </w:numPr>
+        <w:spacing w:after="0"/>
+        <w:rPr>
+          <w:rFonts w:eastAsia="新細明體"/>
+          <w:i/>
+          <w:iCs/>
+          <w:lang w:eastAsia="zh-TW"/>
+        </w:rPr>
+      </w:pPr>
+      <w:r>
+        <w:rPr>
+          <w:rFonts w:eastAsia="新細明體"/>
+          <w:b/>
+          <w:bCs/>
+          <w:i/>
+          <w:iCs/>
+          <w:lang w:eastAsia="zh-TW"/>
+        </w:rPr>
+        <w:t>from_datapoint()</w:t>
+      </w:r>
+      <w:r>
+        <w:rPr>
+          <w:rFonts w:eastAsia="新細明體"/>
+          <w:i/>
+          <w:iCs/>
+          <w:lang w:eastAsia="zh-TW"/>
+        </w:rPr>
+        <w:t>：逐筆過濾資料點</w:t>
+      </w:r>
+      <w:r>
+        <w:rPr>
+          <w:rFonts w:eastAsia="新細明體" w:hint="eastAsia"/>
+          <w:i/>
+          <w:iCs/>
           <w:lang w:eastAsia="zh-TW"/>
         </w:rPr>
         <w:t xml:space="preserve"> </w:t>
@@ -79,43 +542,584 @@
       <w:r>
         <w:rPr>
           <w:rFonts w:eastAsia="新細明體" w:hint="eastAsia"/>
-          <w:lang w:eastAsia="zh-TW"/>
-        </w:rPr>
-        <w:t>的類，用於從</w:t>
-      </w:r>
-      <w:r>
-        <w:rPr>
-          <w:rFonts w:eastAsia="新細明體"/>
-          <w:lang w:eastAsia="zh-TW"/>
-        </w:rPr>
-        <w:t xml:space="preserve"> Amazon Reviews </w:t>
-      </w:r>
-      <w:r>
-        <w:rPr>
-          <w:rFonts w:eastAsia="新細明體" w:hint="eastAsia"/>
-          <w:lang w:eastAsia="zh-TW"/>
-        </w:rPr>
-        <w:t>資料集中載入、清洗並轉換原始資料為結構化的</w:t>
-      </w:r>
-      <w:r>
-        <w:rPr>
-          <w:rFonts w:eastAsia="新細明體"/>
+          <w:i/>
+          <w:iCs/>
+          <w:lang w:eastAsia="zh-TW"/>
+        </w:rPr>
+        <w:t>, (</w:t>
+      </w:r>
+      <w:r>
+        <w:rPr>
+          <w:rFonts w:eastAsia="新細明體"/>
+          <w:i/>
+          <w:iCs/>
+          <w:lang w:eastAsia="zh-TW"/>
+        </w:rPr>
+        <w:t>價格</w:t>
+      </w:r>
+      <w:r>
+        <w:rPr>
+          <w:rFonts w:eastAsia="新細明體"/>
+          <w:i/>
+          <w:iCs/>
+          <w:lang w:eastAsia="zh-TW"/>
+        </w:rPr>
+        <w:t xml:space="preserve"> ≥ 0.5 </w:t>
+      </w:r>
+      <w:r>
+        <w:rPr>
+          <w:rFonts w:eastAsia="新細明體"/>
+          <w:i/>
+          <w:iCs/>
+          <w:lang w:eastAsia="zh-TW"/>
+        </w:rPr>
+        <w:t>且</w:t>
+      </w:r>
+      <w:r>
+        <w:rPr>
+          <w:rFonts w:eastAsia="新細明體"/>
+          <w:i/>
+          <w:iCs/>
+          <w:lang w:eastAsia="zh-TW"/>
+        </w:rPr>
+        <w:t xml:space="preserve"> ≤ 999.49</w:t>
+      </w:r>
+      <w:r>
+        <w:rPr>
+          <w:rFonts w:eastAsia="新細明體" w:hint="eastAsia"/>
+          <w:i/>
+          <w:iCs/>
+          <w:lang w:eastAsia="zh-TW"/>
+        </w:rPr>
+        <w:t>)</w:t>
+      </w:r>
+    </w:p>
+    <w:p>
+      <w:pPr>
+        <w:numPr>
+          <w:ilvl w:val="0"/>
+          <w:numId w:val="10"/>
+        </w:numPr>
+        <w:spacing w:after="0"/>
+        <w:rPr>
+          <w:rFonts w:eastAsia="新細明體"/>
+          <w:i/>
+          <w:iCs/>
+          <w:lang w:eastAsia="zh-TW"/>
+        </w:rPr>
+      </w:pPr>
+      <w:r>
+        <w:rPr>
+          <w:rFonts w:eastAsia="新細明體"/>
+          <w:b/>
+          <w:bCs/>
+          <w:i/>
+          <w:iCs/>
+          <w:lang w:eastAsia="zh-TW"/>
+        </w:rPr>
+        <w:t>Item(...)</w:t>
+      </w:r>
+      <w:r>
+        <w:rPr>
+          <w:rFonts w:eastAsia="新細明體"/>
+          <w:i/>
+          <w:iCs/>
+          <w:lang w:eastAsia="zh-TW"/>
+        </w:rPr>
+        <w:t>：建立</w:t>
+      </w:r>
+      <w:r>
+        <w:rPr>
+          <w:rFonts w:eastAsia="新細明體"/>
+          <w:i/>
+          <w:iCs/>
           <w:lang w:eastAsia="zh-TW"/>
         </w:rPr>
         <w:t xml:space="preserve"> Item </w:t>
       </w:r>
       <w:r>
         <w:rPr>
-          <w:rFonts w:eastAsia="新細明體" w:hint="eastAsia"/>
-          <w:lang w:eastAsia="zh-TW"/>
-        </w:rPr>
-        <w:t>物件。支援並行處理以提高資料處理效率。</w:t>
+          <w:rFonts w:eastAsia="新細明體"/>
+          <w:i/>
+          <w:iCs/>
+          <w:lang w:eastAsia="zh-TW"/>
+        </w:rPr>
+        <w:t>物件</w:t>
+      </w:r>
+    </w:p>
+    <w:p>
+      <w:pPr>
+        <w:numPr>
+          <w:ilvl w:val="0"/>
+          <w:numId w:val="10"/>
+        </w:numPr>
+        <w:spacing w:after="0"/>
+        <w:rPr>
+          <w:rFonts w:eastAsia="新細明體"/>
+          <w:i/>
+          <w:iCs/>
+          <w:lang w:eastAsia="zh-TW"/>
+        </w:rPr>
+      </w:pPr>
+      <w:r>
+        <w:rPr>
+          <w:rFonts w:eastAsia="新細明體"/>
+          <w:b/>
+          <w:bCs/>
+          <w:i/>
+          <w:iCs/>
+          <w:lang w:eastAsia="zh-TW"/>
+        </w:rPr>
+        <w:t>Item.parse()</w:t>
+      </w:r>
+      <w:r>
+        <w:rPr>
+          <w:rFonts w:eastAsia="新細明體"/>
+          <w:i/>
+          <w:iCs/>
+          <w:lang w:eastAsia="zh-TW"/>
+        </w:rPr>
+        <w:t>：決定該資料是否合格</w:t>
+      </w:r>
+      <w:r>
+        <w:rPr>
+          <w:rFonts w:eastAsia="新細明體"/>
+          <w:i/>
+          <w:iCs/>
+          <w:lang w:eastAsia="zh-TW"/>
+        </w:rPr>
+        <w:t xml:space="preserve"> (include=True</w:t>
+      </w:r>
+      <w:r>
+        <w:rPr>
+          <w:rFonts w:eastAsia="新細明體" w:hint="eastAsia"/>
+          <w:i/>
+          <w:iCs/>
+          <w:lang w:eastAsia="zh-TW"/>
+        </w:rPr>
+        <w:t>)</w:t>
+      </w:r>
+    </w:p>
+    <w:p>
+      <w:pPr>
+        <w:spacing w:after="0"/>
+        <w:rPr>
+          <w:rFonts w:eastAsia="新細明體"/>
+          <w:i/>
+          <w:iCs/>
+          <w:lang w:eastAsia="zh-TW"/>
+        </w:rPr>
+      </w:pPr>
+    </w:p>
+    <w:p>
+      <w:pPr>
+        <w:spacing w:after="0"/>
+        <w:rPr>
+          <w:rFonts w:eastAsia="新細明體"/>
+          <w:b/>
+          <w:bCs/>
+          <w:i/>
+          <w:iCs/>
+          <w:lang w:eastAsia="zh-TW"/>
+        </w:rPr>
+      </w:pPr>
+      <w:r>
+        <w:rPr>
+          <w:rFonts w:ascii="Segoe UI Emoji" w:eastAsia="新細明體" w:hAnsi="Segoe UI Emoji" w:cs="Segoe UI Emoji"/>
+          <w:b/>
+          <w:bCs/>
+          <w:i/>
+          <w:iCs/>
+          <w:lang w:eastAsia="zh-TW"/>
+        </w:rPr>
+        <w:t>📌</w:t>
+      </w:r>
+      <w:r>
+        <w:rPr>
+          <w:rFonts w:eastAsia="新細明體"/>
+          <w:b/>
+          <w:bCs/>
+          <w:i/>
+          <w:iCs/>
+          <w:lang w:eastAsia="zh-TW"/>
+        </w:rPr>
+        <w:t xml:space="preserve"> </w:t>
+      </w:r>
+      <w:r>
+        <w:rPr>
+          <w:rFonts w:eastAsia="新細明體"/>
+          <w:b/>
+          <w:bCs/>
+          <w:i/>
+          <w:iCs/>
+          <w:lang w:eastAsia="zh-TW"/>
+        </w:rPr>
+        <w:t>多進程</w:t>
+      </w:r>
+      <w:r>
+        <w:rPr>
+          <w:rFonts w:eastAsia="新細明體"/>
+          <w:b/>
+          <w:bCs/>
+          <w:i/>
+          <w:iCs/>
+          <w:lang w:eastAsia="zh-TW"/>
+        </w:rPr>
+        <w:t xml:space="preserve"> pool.map(...) </w:t>
+      </w:r>
+      <w:r>
+        <w:rPr>
+          <w:rFonts w:eastAsia="新細明體"/>
+          <w:b/>
+          <w:bCs/>
+          <w:i/>
+          <w:iCs/>
+          <w:lang w:eastAsia="zh-TW"/>
+        </w:rPr>
+        <w:t>的精髓：</w:t>
+      </w:r>
+    </w:p>
+    <w:p>
+      <w:pPr>
+        <w:numPr>
+          <w:ilvl w:val="0"/>
+          <w:numId w:val="12"/>
+        </w:numPr>
+        <w:spacing w:after="0"/>
+        <w:rPr>
+          <w:rFonts w:eastAsia="新細明體"/>
+          <w:i/>
+          <w:iCs/>
+          <w:lang w:eastAsia="zh-TW"/>
+        </w:rPr>
+      </w:pPr>
+      <w:r>
+        <w:rPr>
+          <w:rFonts w:ascii="Segoe UI Emoji" w:eastAsia="新細明體" w:hAnsi="Segoe UI Emoji" w:cs="Segoe UI Emoji"/>
+          <w:i/>
+          <w:iCs/>
+          <w:lang w:eastAsia="zh-TW"/>
+        </w:rPr>
+        <w:t>👷</w:t>
+      </w:r>
+      <w:r>
+        <w:rPr>
+          <w:rFonts w:eastAsia="新細明體"/>
+          <w:i/>
+          <w:iCs/>
+          <w:lang w:eastAsia="zh-TW"/>
+        </w:rPr>
+        <w:t>‍</w:t>
+      </w:r>
+      <w:r>
+        <w:rPr>
+          <w:rFonts w:ascii="Segoe UI Emoji" w:eastAsia="新細明體" w:hAnsi="Segoe UI Emoji" w:cs="Segoe UI Emoji"/>
+          <w:i/>
+          <w:iCs/>
+          <w:lang w:eastAsia="zh-TW"/>
+        </w:rPr>
+        <w:t>♂️</w:t>
+      </w:r>
+      <w:r>
+        <w:rPr>
+          <w:rFonts w:eastAsia="新細明體"/>
+          <w:i/>
+          <w:iCs/>
+          <w:lang w:eastAsia="zh-TW"/>
+        </w:rPr>
+        <w:t xml:space="preserve"> </w:t>
+      </w:r>
+      <w:r>
+        <w:rPr>
+          <w:rFonts w:eastAsia="新細明體"/>
+          <w:i/>
+          <w:iCs/>
+          <w:lang w:eastAsia="zh-TW"/>
+        </w:rPr>
+        <w:t>同時分工</w:t>
+      </w:r>
+      <w:r>
+        <w:rPr>
+          <w:rFonts w:eastAsia="新細明體"/>
+          <w:i/>
+          <w:iCs/>
+          <w:lang w:eastAsia="zh-TW"/>
+        </w:rPr>
+        <w:t xml:space="preserve"> → </w:t>
+      </w:r>
+      <w:r>
+        <w:rPr>
+          <w:rFonts w:eastAsia="新細明體"/>
+          <w:i/>
+          <w:iCs/>
+          <w:lang w:eastAsia="zh-TW"/>
+        </w:rPr>
+        <w:t>提高效率</w:t>
+      </w:r>
+    </w:p>
+    <w:p>
+      <w:pPr>
+        <w:numPr>
+          <w:ilvl w:val="0"/>
+          <w:numId w:val="12"/>
+        </w:numPr>
+        <w:spacing w:after="0"/>
+        <w:rPr>
+          <w:rFonts w:eastAsia="新細明體"/>
+          <w:i/>
+          <w:iCs/>
+          <w:lang w:eastAsia="zh-TW"/>
+        </w:rPr>
+      </w:pPr>
+      <w:r>
+        <w:rPr>
+          <w:rFonts w:ascii="Segoe UI Emoji" w:eastAsia="新細明體" w:hAnsi="Segoe UI Emoji" w:cs="Segoe UI Emoji"/>
+          <w:i/>
+          <w:iCs/>
+          <w:lang w:eastAsia="zh-TW"/>
+        </w:rPr>
+        <w:t>✅</w:t>
+      </w:r>
+      <w:r>
+        <w:rPr>
+          <w:rFonts w:eastAsia="新細明體"/>
+          <w:i/>
+          <w:iCs/>
+          <w:lang w:eastAsia="zh-TW"/>
+        </w:rPr>
+        <w:t xml:space="preserve"> </w:t>
+      </w:r>
+      <w:r>
+        <w:rPr>
+          <w:rFonts w:eastAsia="新細明體"/>
+          <w:i/>
+          <w:iCs/>
+          <w:lang w:eastAsia="zh-TW"/>
+        </w:rPr>
+        <w:t>篩選條件集中管理</w:t>
+      </w:r>
+      <w:r>
+        <w:rPr>
+          <w:rFonts w:eastAsia="新細明體"/>
+          <w:i/>
+          <w:iCs/>
+          <w:lang w:eastAsia="zh-TW"/>
+        </w:rPr>
+        <w:t xml:space="preserve"> → </w:t>
+      </w:r>
+      <w:r>
+        <w:rPr>
+          <w:rFonts w:eastAsia="新細明體"/>
+          <w:i/>
+          <w:iCs/>
+          <w:lang w:eastAsia="zh-TW"/>
+        </w:rPr>
+        <w:t>保持資料一致性</w:t>
+      </w:r>
+    </w:p>
+    <w:p>
+      <w:pPr>
+        <w:numPr>
+          <w:ilvl w:val="0"/>
+          <w:numId w:val="12"/>
+        </w:numPr>
+        <w:spacing w:after="0"/>
+        <w:rPr>
+          <w:rFonts w:eastAsia="新細明體"/>
+          <w:i/>
+          <w:iCs/>
+          <w:lang w:eastAsia="zh-TW"/>
+        </w:rPr>
+      </w:pPr>
+      <w:r>
+        <w:rPr>
+          <w:rFonts w:ascii="Segoe UI Emoji" w:eastAsia="新細明體" w:hAnsi="Segoe UI Emoji" w:cs="Segoe UI Emoji"/>
+          <w:i/>
+          <w:iCs/>
+          <w:lang w:eastAsia="zh-TW"/>
+        </w:rPr>
+        <w:t>💾</w:t>
+      </w:r>
+      <w:r>
+        <w:rPr>
+          <w:rFonts w:eastAsia="新細明體"/>
+          <w:i/>
+          <w:iCs/>
+          <w:lang w:eastAsia="zh-TW"/>
+        </w:rPr>
+        <w:t xml:space="preserve"> </w:t>
+      </w:r>
+      <w:r>
+        <w:rPr>
+          <w:rFonts w:eastAsia="新細明體"/>
+          <w:i/>
+          <w:iCs/>
+          <w:lang w:eastAsia="zh-TW"/>
+        </w:rPr>
+        <w:t>記憶體壓力低</w:t>
+      </w:r>
+      <w:r>
+        <w:rPr>
+          <w:rFonts w:eastAsia="新細明體"/>
+          <w:i/>
+          <w:iCs/>
+          <w:lang w:eastAsia="zh-TW"/>
+        </w:rPr>
+        <w:t xml:space="preserve"> → </w:t>
+      </w:r>
+      <w:r>
+        <w:rPr>
+          <w:rFonts w:eastAsia="新細明體"/>
+          <w:i/>
+          <w:iCs/>
+          <w:lang w:eastAsia="zh-TW"/>
+        </w:rPr>
+        <w:t>每次只處理一小塊</w:t>
+      </w:r>
+    </w:p>
+    <w:p>
+      <w:pPr>
+        <w:spacing w:after="0"/>
+        <w:rPr>
+          <w:rFonts w:eastAsia="新細明體"/>
+          <w:i/>
+          <w:iCs/>
+          <w:lang w:eastAsia="zh-TW"/>
+        </w:rPr>
+      </w:pPr>
+    </w:p>
+    <w:p>
+      <w:pPr>
+        <w:spacing w:after="0"/>
+        <w:rPr>
+          <w:rFonts w:eastAsia="新細明體" w:hint="eastAsia"/>
+          <w:i/>
+          <w:iCs/>
+          <w:lang w:eastAsia="zh-TW"/>
+        </w:rPr>
+      </w:pPr>
+      <w:r>
+        <w:rPr>
+          <w:rFonts w:ascii="Segoe UI Emoji" w:eastAsia="新細明體" w:hAnsi="Segoe UI Emoji" w:cs="Segoe UI Emoji"/>
+          <w:i/>
+          <w:iCs/>
+          <w:lang w:eastAsia="zh-TW"/>
+        </w:rPr>
+        <w:t>👷</w:t>
+      </w:r>
+      <w:r>
+        <w:rPr>
+          <w:rFonts w:eastAsia="新細明體"/>
+          <w:i/>
+          <w:iCs/>
+          <w:lang w:eastAsia="zh-TW"/>
+        </w:rPr>
+        <w:t>‍</w:t>
+      </w:r>
+      <w:r>
+        <w:rPr>
+          <w:rFonts w:ascii="Segoe UI Emoji" w:eastAsia="新細明體" w:hAnsi="Segoe UI Emoji" w:cs="Segoe UI Emoji"/>
+          <w:i/>
+          <w:iCs/>
+          <w:lang w:eastAsia="zh-TW"/>
+        </w:rPr>
+        <w:t>♂️</w:t>
+      </w:r>
+      <w:r>
+        <w:rPr>
+          <w:rFonts w:eastAsia="新細明體"/>
+          <w:i/>
+          <w:iCs/>
+          <w:lang w:eastAsia="zh-TW"/>
+        </w:rPr>
+        <w:t xml:space="preserve"> </w:t>
+      </w:r>
+      <w:r>
+        <w:rPr>
+          <w:rFonts w:eastAsia="新細明體"/>
+          <w:i/>
+          <w:iCs/>
+          <w:lang w:eastAsia="zh-TW"/>
+        </w:rPr>
+        <w:t>我有一大箱</w:t>
+      </w:r>
+      <w:r>
+        <w:rPr>
+          <w:rFonts w:eastAsia="新細明體"/>
+          <w:i/>
+          <w:iCs/>
+          <w:lang w:eastAsia="zh-TW"/>
+        </w:rPr>
+        <w:t xml:space="preserve"> 3000 </w:t>
+      </w:r>
+      <w:r>
+        <w:rPr>
+          <w:rFonts w:eastAsia="新細明體"/>
+          <w:i/>
+          <w:iCs/>
+          <w:lang w:eastAsia="zh-TW"/>
+        </w:rPr>
+        <w:t>本書，我找了</w:t>
+      </w:r>
+      <w:r>
+        <w:rPr>
+          <w:rFonts w:eastAsia="新細明體"/>
+          <w:i/>
+          <w:iCs/>
+          <w:lang w:eastAsia="zh-TW"/>
+        </w:rPr>
+        <w:t xml:space="preserve"> 3 </w:t>
+      </w:r>
+      <w:r>
+        <w:rPr>
+          <w:rFonts w:eastAsia="新細明體"/>
+          <w:i/>
+          <w:iCs/>
+          <w:lang w:eastAsia="zh-TW"/>
+        </w:rPr>
+        <w:t>個工讀生同時幫我整理這些書（每人處理</w:t>
+      </w:r>
+      <w:r>
+        <w:rPr>
+          <w:rFonts w:eastAsia="新細明體"/>
+          <w:i/>
+          <w:iCs/>
+          <w:lang w:eastAsia="zh-TW"/>
+        </w:rPr>
+        <w:t xml:space="preserve"> 1000 </w:t>
+      </w:r>
+      <w:r>
+        <w:rPr>
+          <w:rFonts w:eastAsia="新細明體"/>
+          <w:i/>
+          <w:iCs/>
+          <w:lang w:eastAsia="zh-TW"/>
+        </w:rPr>
+        <w:t>本），每人都幫我</w:t>
+      </w:r>
+      <w:r>
+        <w:rPr>
+          <w:rFonts w:eastAsia="新細明體"/>
+          <w:i/>
+          <w:iCs/>
+          <w:lang w:eastAsia="zh-TW"/>
+        </w:rPr>
+        <w:t>根據條件刪選</w:t>
+      </w:r>
+      <w:r>
+        <w:rPr>
+          <w:rFonts w:eastAsia="新細明體"/>
+          <w:i/>
+          <w:iCs/>
+          <w:lang w:eastAsia="zh-TW"/>
+        </w:rPr>
+        <w:t>挑出好書，然後我把這些好書收集起來。</w:t>
       </w:r>
     </w:p>
     <w:p>
       <w:r>
         <w:pict w14:anchorId="0F27B4D3">
-          <v:rect id="_x0000_i1092" style="width:0;height:1.5pt" o:hralign="center" o:hrstd="t" o:hr="t" fillcolor="#a0a0a0" stroked="f"/>
+          <v:rect id="_x0000_i1025" style="width:0;height:1.5pt" o:hralign="center" o:hrstd="t" o:hr="t" fillcolor="#a0a0a0" stroked="f"/>
         </w:pict>
       </w:r>
     </w:p>
@@ -198,6 +1202,7 @@
           <w:rFonts w:eastAsia="新細明體"/>
           <w:lang w:eastAsia="zh-TW"/>
         </w:rPr>
+        <w:lastRenderedPageBreak/>
         <w:t>MAX_PRICE = 999.49</w:t>
       </w:r>
       <w:r>
@@ -214,7 +1219,7 @@
     <w:p>
       <w:r>
         <w:pict w14:anchorId="0150C305">
-          <v:rect id="_x0000_i1093" style="width:0;height:1.5pt" o:hralign="center" o:hrstd="t" o:hr="t" fillcolor="#a0a0a0" stroked="f"/>
+          <v:rect id="_x0000_i1026" style="width:0;height:1.5pt" o:hralign="center" o:hrstd="t" o:hr="t" fillcolor="#a0a0a0" stroked="f"/>
         </w:pict>
       </w:r>
     </w:p>
@@ -234,7 +1239,6 @@
         </w:rPr>
         <w:t>類定義：</w:t>
       </w:r>
-      <w:proofErr w:type="spellStart"/>
       <w:r>
         <w:rPr>
           <w:rFonts w:eastAsia="新細明體"/>
@@ -244,7 +1248,6 @@
         </w:rPr>
         <w:t>ItemLoader</w:t>
       </w:r>
-      <w:proofErr w:type="spellEnd"/>
     </w:p>
     <w:p>
       <w:pPr>
@@ -269,27 +1272,7 @@
           <w:bCs/>
           <w:lang w:eastAsia="zh-TW"/>
         </w:rPr>
-        <w:t xml:space="preserve"> __</w:t>
-      </w:r>
-      <w:proofErr w:type="spellStart"/>
-      <w:r>
-        <w:rPr>
-          <w:rFonts w:eastAsia="新細明體"/>
-          <w:b/>
-          <w:bCs/>
-          <w:lang w:eastAsia="zh-TW"/>
-        </w:rPr>
-        <w:t>init</w:t>
-      </w:r>
-      <w:proofErr w:type="spellEnd"/>
-      <w:r>
-        <w:rPr>
-          <w:rFonts w:eastAsia="新細明體"/>
-          <w:b/>
-          <w:bCs/>
-          <w:lang w:eastAsia="zh-TW"/>
-        </w:rPr>
-        <w:t>__(self, name)</w:t>
+        <w:t xml:space="preserve"> __init__(self, name)</w:t>
       </w:r>
     </w:p>
     <w:p>
@@ -398,7 +1381,7 @@
     <w:p>
       <w:r>
         <w:pict w14:anchorId="12564B6B">
-          <v:rect id="_x0000_i1094" style="width:0;height:1.5pt" o:hralign="center" o:hrstd="t" o:hr="t" fillcolor="#a0a0a0" stroked="f"/>
+          <v:rect id="_x0000_i1027" style="width:0;height:1.5pt" o:hralign="center" o:hrstd="t" o:hr="t" fillcolor="#a0a0a0" stroked="f"/>
         </w:pict>
       </w:r>
     </w:p>
@@ -418,45 +1401,14 @@
         </w:rPr>
         <w:t>方法：</w:t>
       </w:r>
-      <w:proofErr w:type="spellStart"/>
-      <w:r>
-        <w:rPr>
-          <w:rFonts w:eastAsia="新細明體"/>
-          <w:b/>
-          <w:bCs/>
-          <w:lang w:eastAsia="zh-TW"/>
-        </w:rPr>
-        <w:t>from_</w:t>
-      </w:r>
-      <w:proofErr w:type="gramStart"/>
-      <w:r>
-        <w:rPr>
-          <w:rFonts w:eastAsia="新細明體"/>
-          <w:b/>
-          <w:bCs/>
-          <w:lang w:eastAsia="zh-TW"/>
-        </w:rPr>
-        <w:t>datapoint</w:t>
-      </w:r>
-      <w:proofErr w:type="spellEnd"/>
-      <w:r>
-        <w:rPr>
-          <w:rFonts w:eastAsia="新細明體"/>
-          <w:b/>
-          <w:bCs/>
-          <w:lang w:eastAsia="zh-TW"/>
-        </w:rPr>
-        <w:t>(</w:t>
-      </w:r>
-      <w:proofErr w:type="gramEnd"/>
-      <w:r>
-        <w:rPr>
-          <w:rFonts w:eastAsia="新細明體"/>
-          <w:b/>
-          <w:bCs/>
-          <w:lang w:eastAsia="zh-TW"/>
-        </w:rPr>
-        <w:t>self, datapoint)</w:t>
+      <w:r>
+        <w:rPr>
+          <w:rFonts w:eastAsia="新細明體"/>
+          <w:b/>
+          <w:bCs/>
+          <w:lang w:eastAsia="zh-TW"/>
+        </w:rPr>
+        <w:t>from_datapoint(self, datapoint)</w:t>
       </w:r>
     </w:p>
     <w:p>
@@ -563,7 +1515,24 @@
           <w:rFonts w:eastAsia="新細明體"/>
           <w:lang w:eastAsia="zh-TW"/>
         </w:rPr>
-        <w:t xml:space="preserve"> Item </w:t>
+        <w:t xml:space="preserve"> </w:t>
+      </w:r>
+      <w:r>
+        <w:rPr>
+          <w:rFonts w:eastAsia="新細明體"/>
+          <w:b/>
+          <w:bCs/>
+          <w:color w:val="FF0000"/>
+          <w:lang w:eastAsia="zh-TW"/>
+        </w:rPr>
+        <w:t>Item</w:t>
+      </w:r>
+      <w:r>
+        <w:rPr>
+          <w:rFonts w:eastAsia="新細明體"/>
+          <w:lang w:eastAsia="zh-TW"/>
+        </w:rPr>
+        <w:t xml:space="preserve"> </w:t>
       </w:r>
       <w:r>
         <w:rPr>
@@ -577,23 +1546,7 @@
           <w:rFonts w:eastAsia="新細明體"/>
           <w:lang w:eastAsia="zh-TW"/>
         </w:rPr>
-        <w:t xml:space="preserve"> </w:t>
-      </w:r>
-      <w:proofErr w:type="spellStart"/>
-      <w:r>
-        <w:rPr>
-          <w:rFonts w:eastAsia="新細明體"/>
-          <w:lang w:eastAsia="zh-TW"/>
-        </w:rPr>
-        <w:t>item.include</w:t>
-      </w:r>
-      <w:proofErr w:type="spellEnd"/>
-      <w:r>
-        <w:rPr>
-          <w:rFonts w:eastAsia="新細明體"/>
-          <w:lang w:eastAsia="zh-TW"/>
-        </w:rPr>
-        <w:t xml:space="preserve"> </w:t>
+        <w:t xml:space="preserve"> item.include </w:t>
       </w:r>
       <w:r>
         <w:rPr>
@@ -643,6 +1596,94 @@
           <w:lang w:eastAsia="zh-TW"/>
         </w:rPr>
         <w:t>。</w:t>
+      </w:r>
+    </w:p>
+    <w:p>
+      <w:pPr>
+        <w:numPr>
+          <w:ilvl w:val="1"/>
+          <w:numId w:val="3"/>
+        </w:numPr>
+        <w:rPr>
+          <w:lang w:eastAsia="zh-TW"/>
+        </w:rPr>
+      </w:pPr>
+      <w:r>
+        <w:rPr>
+          <w:lang w:eastAsia="zh-TW"/>
+        </w:rPr>
+        <w:t>字元數量限制</w:t>
+      </w:r>
+      <w:r>
+        <w:rPr>
+          <w:lang w:eastAsia="zh-TW"/>
+        </w:rPr>
+        <w:t xml:space="preserve"> MIN_CHARS = 300</w:t>
+      </w:r>
+    </w:p>
+    <w:p>
+      <w:pPr>
+        <w:numPr>
+          <w:ilvl w:val="1"/>
+          <w:numId w:val="3"/>
+        </w:numPr>
+        <w:rPr>
+          <w:lang w:eastAsia="zh-TW"/>
+        </w:rPr>
+      </w:pPr>
+      <w:r>
+        <w:rPr>
+          <w:lang w:eastAsia="zh-TW"/>
+        </w:rPr>
+        <w:t xml:space="preserve">Token </w:t>
+      </w:r>
+      <w:r>
+        <w:rPr>
+          <w:lang w:eastAsia="zh-TW"/>
+        </w:rPr>
+        <w:t>數量下限</w:t>
+      </w:r>
+      <w:r>
+        <w:rPr>
+          <w:lang w:eastAsia="zh-TW"/>
+        </w:rPr>
+        <w:t xml:space="preserve"> MIN_TOKENS = 150</w:t>
+      </w:r>
+    </w:p>
+    <w:p>
+      <w:pPr>
+        <w:numPr>
+          <w:ilvl w:val="1"/>
+          <w:numId w:val="3"/>
+        </w:numPr>
+        <w:rPr>
+          <w:lang w:eastAsia="zh-TW"/>
+        </w:rPr>
+      </w:pPr>
+      <w:r>
+        <w:rPr>
+          <w:lang w:eastAsia="zh-TW"/>
+        </w:rPr>
+        <w:t xml:space="preserve">Token </w:t>
+      </w:r>
+      <w:r>
+        <w:rPr>
+          <w:lang w:eastAsia="zh-TW"/>
+        </w:rPr>
+        <w:t>數量</w:t>
+      </w:r>
+      <w:r>
+        <w:rPr>
+          <w:rFonts w:eastAsia="新細明體" w:hint="eastAsia"/>
+          <w:lang w:eastAsia="zh-TW"/>
+        </w:rPr>
+        <w:t>上限</w:t>
+      </w:r>
+      <w:r>
+        <w:rPr>
+          <w:lang w:eastAsia="zh-TW"/>
+        </w:rPr>
+        <w:t xml:space="preserve"> MAX_TOKENS = 160</w:t>
       </w:r>
     </w:p>
     <w:p>
@@ -662,7 +1703,6 @@
           <w:bCs/>
           <w:lang w:eastAsia="zh-TW"/>
         </w:rPr>
-        <w:lastRenderedPageBreak/>
         <w:t>異常處理</w:t>
       </w:r>
       <w:r>
@@ -689,7 +1729,7 @@
     <w:p>
       <w:r>
         <w:pict w14:anchorId="13980EFB">
-          <v:rect id="_x0000_i1095" style="width:0;height:1.5pt" o:hralign="center" o:hrstd="t" o:hr="t" fillcolor="#a0a0a0" stroked="f"/>
+          <v:rect id="_x0000_i1028" style="width:0;height:1.5pt" o:hralign="center" o:hrstd="t" o:hr="t" fillcolor="#a0a0a0" stroked="f"/>
         </w:pict>
       </w:r>
     </w:p>
@@ -709,45 +1749,14 @@
         </w:rPr>
         <w:t>方法：</w:t>
       </w:r>
-      <w:proofErr w:type="spellStart"/>
-      <w:r>
-        <w:rPr>
-          <w:rFonts w:eastAsia="新細明體"/>
-          <w:b/>
-          <w:bCs/>
-          <w:lang w:eastAsia="zh-TW"/>
-        </w:rPr>
-        <w:t>from_</w:t>
-      </w:r>
-      <w:proofErr w:type="gramStart"/>
-      <w:r>
-        <w:rPr>
-          <w:rFonts w:eastAsia="新細明體"/>
-          <w:b/>
-          <w:bCs/>
-          <w:lang w:eastAsia="zh-TW"/>
-        </w:rPr>
-        <w:t>chunk</w:t>
-      </w:r>
-      <w:proofErr w:type="spellEnd"/>
-      <w:r>
-        <w:rPr>
-          <w:rFonts w:eastAsia="新細明體"/>
-          <w:b/>
-          <w:bCs/>
-          <w:lang w:eastAsia="zh-TW"/>
-        </w:rPr>
-        <w:t>(</w:t>
-      </w:r>
-      <w:proofErr w:type="gramEnd"/>
-      <w:r>
-        <w:rPr>
-          <w:rFonts w:eastAsia="新細明體"/>
-          <w:b/>
-          <w:bCs/>
-          <w:lang w:eastAsia="zh-TW"/>
-        </w:rPr>
-        <w:t>self, chunk)</w:t>
+      <w:r>
+        <w:rPr>
+          <w:rFonts w:eastAsia="新細明體"/>
+          <w:b/>
+          <w:bCs/>
+          <w:lang w:eastAsia="zh-TW"/>
+        </w:rPr>
+        <w:t>from_chunk(self, chunk)</w:t>
       </w:r>
     </w:p>
     <w:p>
@@ -813,6 +1822,7 @@
           <w:bCs/>
           <w:lang w:eastAsia="zh-TW"/>
         </w:rPr>
+        <w:lastRenderedPageBreak/>
         <w:t>功能</w:t>
       </w:r>
       <w:r>
@@ -837,23 +1847,7 @@
           <w:rFonts w:eastAsia="新細明體"/>
           <w:lang w:eastAsia="zh-TW"/>
         </w:rPr>
-        <w:t xml:space="preserve"> </w:t>
-      </w:r>
-      <w:proofErr w:type="spellStart"/>
-      <w:r>
-        <w:rPr>
-          <w:rFonts w:eastAsia="新細明體"/>
-          <w:lang w:eastAsia="zh-TW"/>
-        </w:rPr>
-        <w:t>from_datapoint</w:t>
-      </w:r>
-      <w:proofErr w:type="spellEnd"/>
-      <w:r>
-        <w:rPr>
-          <w:rFonts w:eastAsia="新細明體"/>
-          <w:lang w:eastAsia="zh-TW"/>
-        </w:rPr>
-        <w:t>()</w:t>
+        <w:t xml:space="preserve"> from_datapoint()</w:t>
       </w:r>
       <w:r>
         <w:rPr>
@@ -880,7 +1874,7 @@
     <w:p>
       <w:r>
         <w:pict w14:anchorId="4B83809F">
-          <v:rect id="_x0000_i1096" style="width:0;height:1.5pt" o:hralign="center" o:hrstd="t" o:hr="t" fillcolor="#a0a0a0" stroked="f"/>
+          <v:rect id="_x0000_i1029" style="width:0;height:1.5pt" o:hralign="center" o:hrstd="t" o:hr="t" fillcolor="#a0a0a0" stroked="f"/>
         </w:pict>
       </w:r>
     </w:p>
@@ -900,25 +1894,14 @@
         </w:rPr>
         <w:t>方法：</w:t>
       </w:r>
-      <w:proofErr w:type="spellStart"/>
-      <w:r>
-        <w:rPr>
-          <w:rFonts w:eastAsia="新細明體"/>
-          <w:b/>
-          <w:bCs/>
-          <w:lang w:eastAsia="zh-TW"/>
-        </w:rPr>
-        <w:t>chunk_generator</w:t>
-      </w:r>
-      <w:proofErr w:type="spellEnd"/>
-      <w:r>
-        <w:rPr>
-          <w:rFonts w:eastAsia="新細明體"/>
-          <w:b/>
-          <w:bCs/>
-          <w:lang w:eastAsia="zh-TW"/>
-        </w:rPr>
-        <w:t>(self)</w:t>
+      <w:r>
+        <w:rPr>
+          <w:rFonts w:eastAsia="新細明體"/>
+          <w:b/>
+          <w:bCs/>
+          <w:lang w:eastAsia="zh-TW"/>
+        </w:rPr>
+        <w:t>chunk_generator(self)</w:t>
       </w:r>
     </w:p>
     <w:p>
@@ -927,6 +1910,9 @@
           <w:ilvl w:val="0"/>
           <w:numId w:val="5"/>
         </w:numPr>
+        <w:rPr>
+          <w:lang w:eastAsia="zh-TW"/>
+        </w:rPr>
       </w:pPr>
       <w:r>
         <w:rPr>
@@ -945,6 +1931,9 @@
         <w:t>：</w:t>
       </w:r>
       <w:r>
+        <w:rPr>
+          <w:lang w:eastAsia="zh-TW"/>
+        </w:rPr>
         <w:br/>
       </w:r>
       <w:r>
@@ -986,7 +1975,7 @@
     <w:p>
       <w:r>
         <w:pict w14:anchorId="0EEA3642">
-          <v:rect id="_x0000_i1097" style="width:0;height:1.5pt" o:hralign="center" o:hrstd="t" o:hr="t" fillcolor="#a0a0a0" stroked="f"/>
+          <v:rect id="_x0000_i1030" style="width:0;height:1.5pt" o:hralign="center" o:hrstd="t" o:hr="t" fillcolor="#a0a0a0" stroked="f"/>
         </w:pict>
       </w:r>
     </w:p>
@@ -1006,45 +1995,14 @@
         </w:rPr>
         <w:t>方法：</w:t>
       </w:r>
-      <w:proofErr w:type="spellStart"/>
-      <w:r>
-        <w:rPr>
-          <w:rFonts w:eastAsia="新細明體"/>
-          <w:b/>
-          <w:bCs/>
-          <w:lang w:eastAsia="zh-TW"/>
-        </w:rPr>
-        <w:t>load_in_</w:t>
-      </w:r>
-      <w:proofErr w:type="gramStart"/>
-      <w:r>
-        <w:rPr>
-          <w:rFonts w:eastAsia="新細明體"/>
-          <w:b/>
-          <w:bCs/>
-          <w:lang w:eastAsia="zh-TW"/>
-        </w:rPr>
-        <w:t>parallel</w:t>
-      </w:r>
-      <w:proofErr w:type="spellEnd"/>
-      <w:r>
-        <w:rPr>
-          <w:rFonts w:eastAsia="新細明體"/>
-          <w:b/>
-          <w:bCs/>
-          <w:lang w:eastAsia="zh-TW"/>
-        </w:rPr>
-        <w:t>(</w:t>
-      </w:r>
-      <w:proofErr w:type="gramEnd"/>
-      <w:r>
-        <w:rPr>
-          <w:rFonts w:eastAsia="新細明體"/>
-          <w:b/>
-          <w:bCs/>
-          <w:lang w:eastAsia="zh-TW"/>
-        </w:rPr>
-        <w:t>self, workers)</w:t>
+      <w:r>
+        <w:rPr>
+          <w:rFonts w:eastAsia="新細明體"/>
+          <w:b/>
+          <w:bCs/>
+          <w:lang w:eastAsia="zh-TW"/>
+        </w:rPr>
+        <w:t>load_in_parallel(self, workers)</w:t>
       </w:r>
     </w:p>
     <w:p>
@@ -1131,23 +2089,7 @@
           <w:rFonts w:eastAsia="新細明體"/>
           <w:lang w:eastAsia="zh-TW"/>
         </w:rPr>
-        <w:t xml:space="preserve"> </w:t>
-      </w:r>
-      <w:proofErr w:type="spellStart"/>
-      <w:r>
-        <w:rPr>
-          <w:rFonts w:eastAsia="新細明體"/>
-          <w:lang w:eastAsia="zh-TW"/>
-        </w:rPr>
-        <w:t>ProcessPoolExecutor</w:t>
-      </w:r>
-      <w:proofErr w:type="spellEnd"/>
-      <w:r>
-        <w:rPr>
-          <w:rFonts w:eastAsia="新細明體"/>
-          <w:lang w:eastAsia="zh-TW"/>
-        </w:rPr>
-        <w:t xml:space="preserve"> </w:t>
+        <w:t xml:space="preserve"> ProcessPoolExecutor </w:t>
       </w:r>
       <w:r>
         <w:rPr>
@@ -1175,40 +2117,15 @@
           <w:rFonts w:eastAsia="新細明體"/>
           <w:lang w:eastAsia="zh-TW"/>
         </w:rPr>
-        <w:t xml:space="preserve"> </w:t>
-      </w:r>
-      <w:proofErr w:type="spellStart"/>
-      <w:r>
-        <w:rPr>
-          <w:rFonts w:eastAsia="新細明體"/>
-          <w:lang w:eastAsia="zh-TW"/>
-        </w:rPr>
-        <w:t>tqdm</w:t>
-      </w:r>
-      <w:proofErr w:type="spellEnd"/>
-      <w:r>
-        <w:rPr>
-          <w:rFonts w:eastAsia="新細明體"/>
-          <w:lang w:eastAsia="zh-TW"/>
-        </w:rPr>
-        <w:t xml:space="preserve"> </w:t>
-      </w:r>
-      <w:r>
-        <w:rPr>
-          <w:rFonts w:eastAsia="新細明體" w:hint="eastAsia"/>
-          <w:lang w:eastAsia="zh-TW"/>
-        </w:rPr>
-        <w:t>顯示進度條。所有結果合併後，為每</w:t>
-      </w:r>
-      <w:proofErr w:type="gramStart"/>
-      <w:r>
-        <w:rPr>
-          <w:rFonts w:eastAsia="新細明體" w:hint="eastAsia"/>
-          <w:lang w:eastAsia="zh-TW"/>
-        </w:rPr>
-        <w:t>個</w:t>
-      </w:r>
-      <w:proofErr w:type="gramEnd"/>
+        <w:t xml:space="preserve"> tqdm </w:t>
+      </w:r>
+      <w:r>
+        <w:rPr>
+          <w:rFonts w:eastAsia="新細明體" w:hint="eastAsia"/>
+          <w:lang w:eastAsia="zh-TW"/>
+        </w:rPr>
+        <w:t>顯示進度條。所有結果合併後，為每個</w:t>
+      </w:r>
       <w:r>
         <w:rPr>
           <w:rFonts w:eastAsia="新細明體"/>
@@ -1235,29 +2152,13 @@
           <w:rFonts w:eastAsia="新細明體" w:hint="eastAsia"/>
           <w:lang w:eastAsia="zh-TW"/>
         </w:rPr>
-        <w:t>為</w:t>
-      </w:r>
-      <w:proofErr w:type="gramStart"/>
-      <w:r>
-        <w:rPr>
-          <w:rFonts w:eastAsia="新細明體" w:hint="eastAsia"/>
-          <w:lang w:eastAsia="zh-TW"/>
-        </w:rPr>
-        <w:t>當前類名</w:t>
-      </w:r>
-      <w:proofErr w:type="gramEnd"/>
-      <w:r>
-        <w:rPr>
-          <w:rFonts w:eastAsia="新細明體" w:hint="eastAsia"/>
-          <w:lang w:eastAsia="zh-TW"/>
-        </w:rPr>
-        <w:t>。</w:t>
+        <w:t>為當前類名。</w:t>
       </w:r>
     </w:p>
     <w:p>
       <w:r>
         <w:pict w14:anchorId="4A303FB8">
-          <v:rect id="_x0000_i1098" style="width:0;height:1.5pt" o:hralign="center" o:hrstd="t" o:hr="t" fillcolor="#a0a0a0" stroked="f"/>
+          <v:rect id="_x0000_i1031" style="width:0;height:1.5pt" o:hralign="center" o:hrstd="t" o:hr="t" fillcolor="#a0a0a0" stroked="f"/>
         </w:pict>
       </w:r>
     </w:p>
@@ -1277,25 +2178,24 @@
         </w:rPr>
         <w:t>方法：</w:t>
       </w:r>
-      <w:proofErr w:type="gramStart"/>
-      <w:r>
-        <w:rPr>
-          <w:rFonts w:eastAsia="新細明體"/>
-          <w:b/>
-          <w:bCs/>
-          <w:lang w:eastAsia="zh-TW"/>
-        </w:rPr>
-        <w:t>load(</w:t>
-      </w:r>
-      <w:proofErr w:type="gramEnd"/>
-      <w:r>
-        <w:rPr>
-          <w:rFonts w:eastAsia="新細明體"/>
-          <w:b/>
-          <w:bCs/>
-          <w:lang w:eastAsia="zh-TW"/>
-        </w:rPr>
-        <w:t>self, workers=8)</w:t>
+      <w:r>
+        <w:rPr>
+          <w:rFonts w:eastAsia="新細明體"/>
+          <w:b/>
+          <w:bCs/>
+          <w:color w:val="FF0000"/>
+          <w:lang w:eastAsia="zh-TW"/>
+        </w:rPr>
+        <w:t>load</w:t>
+      </w:r>
+      <w:r>
+        <w:rPr>
+          <w:rFonts w:eastAsia="新細明體"/>
+          <w:b/>
+          <w:bCs/>
+          <w:lang w:eastAsia="zh-TW"/>
+        </w:rPr>
+        <w:t>(self, workers=8)</w:t>
       </w:r>
     </w:p>
     <w:p>
@@ -1328,6 +2228,9 @@
           <w:ilvl w:val="1"/>
           <w:numId w:val="7"/>
         </w:numPr>
+        <w:rPr>
+          <w:lang w:eastAsia="zh-TW"/>
+        </w:rPr>
       </w:pPr>
       <w:r>
         <w:rPr>
@@ -1410,21 +2313,12 @@
         </w:rPr>
         <w:t>資料集（</w:t>
       </w:r>
-      <w:proofErr w:type="spellStart"/>
-      <w:r>
-        <w:rPr>
-          <w:rFonts w:eastAsia="新細明體"/>
-          <w:lang w:eastAsia="zh-TW"/>
-        </w:rPr>
-        <w:t>raw_meta</w:t>
-      </w:r>
-      <w:proofErr w:type="spellEnd"/>
-      <w:r>
-        <w:rPr>
-          <w:rFonts w:eastAsia="新細明體"/>
-          <w:lang w:eastAsia="zh-TW"/>
-        </w:rPr>
-        <w:t xml:space="preserve"> </w:t>
+      <w:r>
+        <w:rPr>
+          <w:rFonts w:eastAsia="新細明體"/>
+          <w:lang w:eastAsia="zh-TW"/>
+        </w:rPr>
+        <w:t xml:space="preserve">raw_meta </w:t>
       </w:r>
       <w:r>
         <w:rPr>
@@ -1446,7 +2340,6 @@
           <w:rFonts w:eastAsia="新細明體" w:hint="eastAsia"/>
           <w:lang w:eastAsia="zh-TW"/>
         </w:rPr>
-        <w:lastRenderedPageBreak/>
         <w:t>調用</w:t>
       </w:r>
       <w:r>
@@ -1454,23 +2347,7 @@
           <w:rFonts w:eastAsia="新細明體"/>
           <w:lang w:eastAsia="zh-TW"/>
         </w:rPr>
-        <w:t xml:space="preserve"> </w:t>
-      </w:r>
-      <w:proofErr w:type="spellStart"/>
-      <w:r>
-        <w:rPr>
-          <w:rFonts w:eastAsia="新細明體"/>
-          <w:lang w:eastAsia="zh-TW"/>
-        </w:rPr>
-        <w:t>load_in_parallel</w:t>
-      </w:r>
-      <w:proofErr w:type="spellEnd"/>
-      <w:r>
-        <w:rPr>
-          <w:rFonts w:eastAsia="新細明體"/>
-          <w:lang w:eastAsia="zh-TW"/>
-        </w:rPr>
-        <w:t xml:space="preserve">() </w:t>
+        <w:t xml:space="preserve"> load_in_parallel() </w:t>
       </w:r>
       <w:r>
         <w:rPr>
@@ -1486,6 +2363,9 @@
           <w:ilvl w:val="1"/>
           <w:numId w:val="8"/>
         </w:numPr>
+        <w:rPr>
+          <w:lang w:eastAsia="zh-TW"/>
+        </w:rPr>
       </w:pPr>
       <w:r>
         <w:rPr>
@@ -1541,7 +2421,7 @@
     <w:p>
       <w:r>
         <w:pict w14:anchorId="38094318">
-          <v:rect id="_x0000_i1099" style="width:0;height:1.5pt" o:hralign="center" o:hrstd="t" o:hr="t" fillcolor="#a0a0a0" stroked="f"/>
+          <v:rect id="_x0000_i1032" style="width:0;height:1.5pt" o:hralign="center" o:hrstd="t" o:hr="t" fillcolor="#a0a0a0" stroked="f"/>
         </w:pict>
       </w:r>
     </w:p>
@@ -1569,24 +2449,13 @@
           <w:numId w:val="9"/>
         </w:numPr>
       </w:pPr>
-      <w:proofErr w:type="spellStart"/>
-      <w:proofErr w:type="gramStart"/>
-      <w:r>
-        <w:rPr>
-          <w:rFonts w:eastAsia="新細明體"/>
-          <w:lang w:eastAsia="zh-TW"/>
-        </w:rPr>
-        <w:t>datasets.load</w:t>
-      </w:r>
-      <w:proofErr w:type="gramEnd"/>
-      <w:r>
-        <w:rPr>
-          <w:rFonts w:eastAsia="新細明體"/>
-          <w:lang w:eastAsia="zh-TW"/>
-        </w:rPr>
-        <w:t>_dataset</w:t>
-      </w:r>
-      <w:proofErr w:type="spellEnd"/>
+      <w:r>
+        <w:rPr>
+          <w:rFonts w:eastAsia="新細明體"/>
+          <w:lang w:eastAsia="zh-TW"/>
+        </w:rPr>
+        <w:t>datasets.load_dataset</w:t>
+      </w:r>
       <w:r>
         <w:rPr>
           <w:rFonts w:eastAsia="新細明體" w:hint="eastAsia"/>
@@ -1615,16 +2484,18 @@
           <w:ilvl w:val="0"/>
           <w:numId w:val="9"/>
         </w:numPr>
-      </w:pPr>
-      <w:proofErr w:type="spellStart"/>
-      <w:r>
-        <w:rPr>
-          <w:rFonts w:eastAsia="新細明體"/>
-          <w:lang w:eastAsia="zh-TW"/>
-        </w:rPr>
+        <w:rPr>
+          <w:lang w:eastAsia="zh-TW"/>
+        </w:rPr>
+      </w:pPr>
+      <w:r>
+        <w:rPr>
+          <w:rFonts w:eastAsia="新細明體"/>
+          <w:lang w:eastAsia="zh-TW"/>
+        </w:rPr>
+        <w:lastRenderedPageBreak/>
         <w:t>tqdm</w:t>
       </w:r>
-      <w:proofErr w:type="spellEnd"/>
       <w:r>
         <w:rPr>
           <w:rFonts w:eastAsia="新細明體" w:hint="eastAsia"/>
@@ -1640,24 +2511,13 @@
           <w:numId w:val="9"/>
         </w:numPr>
       </w:pPr>
-      <w:proofErr w:type="spellStart"/>
-      <w:proofErr w:type="gramStart"/>
-      <w:r>
-        <w:rPr>
-          <w:rFonts w:eastAsia="新細明體"/>
-          <w:lang w:eastAsia="zh-TW"/>
-        </w:rPr>
-        <w:t>concurrent.futures</w:t>
-      </w:r>
-      <w:proofErr w:type="gramEnd"/>
-      <w:r>
-        <w:rPr>
-          <w:rFonts w:eastAsia="新細明體"/>
-          <w:lang w:eastAsia="zh-TW"/>
-        </w:rPr>
-        <w:t>.ProcessPoolExecutor</w:t>
-      </w:r>
-      <w:proofErr w:type="spellEnd"/>
+      <w:r>
+        <w:rPr>
+          <w:rFonts w:eastAsia="新細明體"/>
+          <w:lang w:eastAsia="zh-TW"/>
+        </w:rPr>
+        <w:t>concurrent.futures.ProcessPoolExecutor</w:t>
+      </w:r>
       <w:r>
         <w:rPr>
           <w:rFonts w:eastAsia="新細明體" w:hint="eastAsia"/>
@@ -1672,9 +2532,10 @@
           <w:ilvl w:val="0"/>
           <w:numId w:val="9"/>
         </w:numPr>
-      </w:pPr>
-      <w:proofErr w:type="spellStart"/>
-      <w:proofErr w:type="gramStart"/>
+        <w:rPr>
+          <w:lang w:eastAsia="zh-TW"/>
+        </w:rPr>
+      </w:pPr>
       <w:r>
         <w:rPr>
           <w:rFonts w:eastAsia="新細明體"/>
@@ -1682,8 +2543,6 @@
         </w:rPr>
         <w:t>items.Item</w:t>
       </w:r>
-      <w:proofErr w:type="spellEnd"/>
-      <w:proofErr w:type="gramEnd"/>
       <w:r>
         <w:rPr>
           <w:rFonts w:eastAsia="新細明體" w:hint="eastAsia"/>
@@ -1695,7 +2554,7 @@
     <w:p>
       <w:r>
         <w:pict w14:anchorId="565FD3F9">
-          <v:rect id="_x0000_i1100" style="width:0;height:1.5pt" o:hralign="center" o:hrstd="t" o:hr="t" fillcolor="#a0a0a0" stroked="f"/>
+          <v:rect id="_x0000_i1033" style="width:0;height:1.5pt" o:hralign="center" o:hrstd="t" o:hr="t" fillcolor="#a0a0a0" stroked="f"/>
         </w:pict>
       </w:r>
     </w:p>
@@ -1717,31 +2576,26 @@
       </w:r>
     </w:p>
     <w:p>
-      <w:r>
-        <w:rPr>
-          <w:rFonts w:eastAsia="新細明體" w:hint="eastAsia"/>
-          <w:lang w:eastAsia="zh-TW"/>
-        </w:rPr>
-        <w:t>本模組適用於對大型電商評論資料的預處理與結構化轉換，常用於推薦系統、情感分析、資料清洗前處理等應用場景，尤其適合分散式</w:t>
-      </w:r>
-      <w:proofErr w:type="gramStart"/>
-      <w:r>
-        <w:rPr>
-          <w:rFonts w:eastAsia="新細明體" w:hint="eastAsia"/>
-          <w:lang w:eastAsia="zh-TW"/>
-        </w:rPr>
-        <w:t>或多核環境</w:t>
-      </w:r>
-      <w:proofErr w:type="gramEnd"/>
-      <w:r>
-        <w:rPr>
-          <w:rFonts w:eastAsia="新細明體" w:hint="eastAsia"/>
-          <w:lang w:eastAsia="zh-TW"/>
-        </w:rPr>
-        <w:t>下批量資料處理。</w:t>
-      </w:r>
-    </w:p>
-    <w:p/>
+      <w:pPr>
+        <w:rPr>
+          <w:lang w:eastAsia="zh-TW"/>
+        </w:rPr>
+      </w:pPr>
+      <w:r>
+        <w:rPr>
+          <w:rFonts w:eastAsia="新細明體" w:hint="eastAsia"/>
+          <w:lang w:eastAsia="zh-TW"/>
+        </w:rPr>
+        <w:t>本模組適用於對大型電商評論資料的預處理與結構化轉換，常用於推薦系統、情感分析、資料清洗前處理等應用場景，尤其適合分散式或多核環境下批量資料處理。</w:t>
+      </w:r>
+    </w:p>
+    <w:p>
+      <w:pPr>
+        <w:rPr>
+          <w:lang w:eastAsia="zh-TW"/>
+        </w:rPr>
+      </w:pPr>
+    </w:p>
     <w:sectPr>
       <w:pgSz w:w="12240" w:h="15840"/>
       <w:pgMar w:top="1440" w:right="1440" w:bottom="1440" w:left="1440" w:header="720" w:footer="720" w:gutter="0"/>
@@ -2053,6 +2907,119 @@
     </w:lvl>
   </w:abstractNum>
   <w:abstractNum w:abstractNumId="2" w15:restartNumberingAfterBreak="0">
+    <w:nsid w:val="138576FC"/>
+    <w:multiLevelType w:val="multilevel"/>
+    <w:tmpl w:val="ABD0BF74"/>
+    <w:lvl w:ilvl="0">
+      <w:start w:val="1"/>
+      <w:numFmt w:val="decimal"/>
+      <w:lvlText w:val="%1."/>
+      <w:lvlJc w:val="left"/>
+      <w:pPr>
+        <w:tabs>
+          <w:tab w:val="num" w:pos="720"/>
+        </w:tabs>
+        <w:ind w:left="720" w:hanging="360"/>
+      </w:pPr>
+    </w:lvl>
+    <w:lvl w:ilvl="1">
+      <w:start w:val="1"/>
+      <w:numFmt w:val="decimal"/>
+      <w:lvlText w:val="%2."/>
+      <w:lvlJc w:val="left"/>
+      <w:pPr>
+        <w:tabs>
+          <w:tab w:val="num" w:pos="1440"/>
+        </w:tabs>
+        <w:ind w:left="1440" w:hanging="360"/>
+      </w:pPr>
+    </w:lvl>
+    <w:lvl w:ilvl="2">
+      <w:start w:val="1"/>
+      <w:numFmt w:val="bullet"/>
+      <w:lvlText w:val=""/>
+      <w:lvlJc w:val="left"/>
+      <w:pPr>
+        <w:ind w:left="2160" w:hanging="360"/>
+      </w:pPr>
+      <w:rPr>
+        <w:rFonts w:ascii="Symbol" w:hAnsi="Symbol" w:hint="default"/>
+      </w:rPr>
+    </w:lvl>
+    <w:lvl w:ilvl="3" w:tentative="1">
+      <w:start w:val="1"/>
+      <w:numFmt w:val="decimal"/>
+      <w:lvlText w:val="%4."/>
+      <w:lvlJc w:val="left"/>
+      <w:pPr>
+        <w:tabs>
+          <w:tab w:val="num" w:pos="2880"/>
+        </w:tabs>
+        <w:ind w:left="2880" w:hanging="360"/>
+      </w:pPr>
+    </w:lvl>
+    <w:lvl w:ilvl="4" w:tentative="1">
+      <w:start w:val="1"/>
+      <w:numFmt w:val="decimal"/>
+      <w:lvlText w:val="%5."/>
+      <w:lvlJc w:val="left"/>
+      <w:pPr>
+        <w:tabs>
+          <w:tab w:val="num" w:pos="3600"/>
+        </w:tabs>
+        <w:ind w:left="3600" w:hanging="360"/>
+      </w:pPr>
+    </w:lvl>
+    <w:lvl w:ilvl="5" w:tentative="1">
+      <w:start w:val="1"/>
+      <w:numFmt w:val="decimal"/>
+      <w:lvlText w:val="%6."/>
+      <w:lvlJc w:val="left"/>
+      <w:pPr>
+        <w:tabs>
+          <w:tab w:val="num" w:pos="4320"/>
+        </w:tabs>
+        <w:ind w:left="4320" w:hanging="360"/>
+      </w:pPr>
+    </w:lvl>
+    <w:lvl w:ilvl="6" w:tentative="1">
+      <w:start w:val="1"/>
+      <w:numFmt w:val="decimal"/>
+      <w:lvlText w:val="%7."/>
+      <w:lvlJc w:val="left"/>
+      <w:pPr>
+        <w:tabs>
+          <w:tab w:val="num" w:pos="5040"/>
+        </w:tabs>
+        <w:ind w:left="5040" w:hanging="360"/>
+      </w:pPr>
+    </w:lvl>
+    <w:lvl w:ilvl="7" w:tentative="1">
+      <w:start w:val="1"/>
+      <w:numFmt w:val="decimal"/>
+      <w:lvlText w:val="%8."/>
+      <w:lvlJc w:val="left"/>
+      <w:pPr>
+        <w:tabs>
+          <w:tab w:val="num" w:pos="5760"/>
+        </w:tabs>
+        <w:ind w:left="5760" w:hanging="360"/>
+      </w:pPr>
+    </w:lvl>
+    <w:lvl w:ilvl="8" w:tentative="1">
+      <w:start w:val="1"/>
+      <w:numFmt w:val="decimal"/>
+      <w:lvlText w:val="%9."/>
+      <w:lvlJc w:val="left"/>
+      <w:pPr>
+        <w:tabs>
+          <w:tab w:val="num" w:pos="6480"/>
+        </w:tabs>
+        <w:ind w:left="6480" w:hanging="360"/>
+      </w:pPr>
+    </w:lvl>
+  </w:abstractNum>
+  <w:abstractNum w:abstractNumId="3" w15:restartNumberingAfterBreak="0">
     <w:nsid w:val="154C3910"/>
     <w:multiLevelType w:val="multilevel"/>
     <w:tmpl w:val="A64099D4"/>
@@ -2201,7 +3168,7 @@
       </w:rPr>
     </w:lvl>
   </w:abstractNum>
-  <w:abstractNum w:abstractNumId="3" w15:restartNumberingAfterBreak="0">
+  <w:abstractNum w:abstractNumId="4" w15:restartNumberingAfterBreak="0">
     <w:nsid w:val="16376DB9"/>
     <w:multiLevelType w:val="multilevel"/>
     <w:tmpl w:val="2F90FB8C"/>
@@ -2350,7 +3317,7 @@
       </w:rPr>
     </w:lvl>
   </w:abstractNum>
-  <w:abstractNum w:abstractNumId="4" w15:restartNumberingAfterBreak="0">
+  <w:abstractNum w:abstractNumId="5" w15:restartNumberingAfterBreak="0">
     <w:nsid w:val="2C32374F"/>
     <w:multiLevelType w:val="multilevel"/>
     <w:tmpl w:val="361EA55A"/>
@@ -2499,7 +3466,7 @@
       </w:rPr>
     </w:lvl>
   </w:abstractNum>
-  <w:abstractNum w:abstractNumId="5" w15:restartNumberingAfterBreak="0">
+  <w:abstractNum w:abstractNumId="6" w15:restartNumberingAfterBreak="0">
     <w:nsid w:val="552D68C7"/>
     <w:multiLevelType w:val="multilevel"/>
     <w:tmpl w:val="ED14BC9E"/>
@@ -2648,7 +3615,120 @@
       </w:rPr>
     </w:lvl>
   </w:abstractNum>
-  <w:abstractNum w:abstractNumId="6" w15:restartNumberingAfterBreak="0">
+  <w:abstractNum w:abstractNumId="7" w15:restartNumberingAfterBreak="0">
+    <w:nsid w:val="62243F29"/>
+    <w:multiLevelType w:val="multilevel"/>
+    <w:tmpl w:val="ABD0BF74"/>
+    <w:lvl w:ilvl="0">
+      <w:start w:val="1"/>
+      <w:numFmt w:val="decimal"/>
+      <w:lvlText w:val="%1."/>
+      <w:lvlJc w:val="left"/>
+      <w:pPr>
+        <w:tabs>
+          <w:tab w:val="num" w:pos="720"/>
+        </w:tabs>
+        <w:ind w:left="720" w:hanging="360"/>
+      </w:pPr>
+    </w:lvl>
+    <w:lvl w:ilvl="1">
+      <w:start w:val="1"/>
+      <w:numFmt w:val="decimal"/>
+      <w:lvlText w:val="%2."/>
+      <w:lvlJc w:val="left"/>
+      <w:pPr>
+        <w:tabs>
+          <w:tab w:val="num" w:pos="1440"/>
+        </w:tabs>
+        <w:ind w:left="1440" w:hanging="360"/>
+      </w:pPr>
+    </w:lvl>
+    <w:lvl w:ilvl="2">
+      <w:start w:val="1"/>
+      <w:numFmt w:val="bullet"/>
+      <w:lvlText w:val=""/>
+      <w:lvlJc w:val="left"/>
+      <w:pPr>
+        <w:ind w:left="2160" w:hanging="360"/>
+      </w:pPr>
+      <w:rPr>
+        <w:rFonts w:ascii="Symbol" w:hAnsi="Symbol" w:hint="default"/>
+      </w:rPr>
+    </w:lvl>
+    <w:lvl w:ilvl="3" w:tentative="1">
+      <w:start w:val="1"/>
+      <w:numFmt w:val="decimal"/>
+      <w:lvlText w:val="%4."/>
+      <w:lvlJc w:val="left"/>
+      <w:pPr>
+        <w:tabs>
+          <w:tab w:val="num" w:pos="2880"/>
+        </w:tabs>
+        <w:ind w:left="2880" w:hanging="360"/>
+      </w:pPr>
+    </w:lvl>
+    <w:lvl w:ilvl="4" w:tentative="1">
+      <w:start w:val="1"/>
+      <w:numFmt w:val="decimal"/>
+      <w:lvlText w:val="%5."/>
+      <w:lvlJc w:val="left"/>
+      <w:pPr>
+        <w:tabs>
+          <w:tab w:val="num" w:pos="3600"/>
+        </w:tabs>
+        <w:ind w:left="3600" w:hanging="360"/>
+      </w:pPr>
+    </w:lvl>
+    <w:lvl w:ilvl="5" w:tentative="1">
+      <w:start w:val="1"/>
+      <w:numFmt w:val="decimal"/>
+      <w:lvlText w:val="%6."/>
+      <w:lvlJc w:val="left"/>
+      <w:pPr>
+        <w:tabs>
+          <w:tab w:val="num" w:pos="4320"/>
+        </w:tabs>
+        <w:ind w:left="4320" w:hanging="360"/>
+      </w:pPr>
+    </w:lvl>
+    <w:lvl w:ilvl="6" w:tentative="1">
+      <w:start w:val="1"/>
+      <w:numFmt w:val="decimal"/>
+      <w:lvlText w:val="%7."/>
+      <w:lvlJc w:val="left"/>
+      <w:pPr>
+        <w:tabs>
+          <w:tab w:val="num" w:pos="5040"/>
+        </w:tabs>
+        <w:ind w:left="5040" w:hanging="360"/>
+      </w:pPr>
+    </w:lvl>
+    <w:lvl w:ilvl="7" w:tentative="1">
+      <w:start w:val="1"/>
+      <w:numFmt w:val="decimal"/>
+      <w:lvlText w:val="%8."/>
+      <w:lvlJc w:val="left"/>
+      <w:pPr>
+        <w:tabs>
+          <w:tab w:val="num" w:pos="5760"/>
+        </w:tabs>
+        <w:ind w:left="5760" w:hanging="360"/>
+      </w:pPr>
+    </w:lvl>
+    <w:lvl w:ilvl="8" w:tentative="1">
+      <w:start w:val="1"/>
+      <w:numFmt w:val="decimal"/>
+      <w:lvlText w:val="%9."/>
+      <w:lvlJc w:val="left"/>
+      <w:pPr>
+        <w:tabs>
+          <w:tab w:val="num" w:pos="6480"/>
+        </w:tabs>
+        <w:ind w:left="6480" w:hanging="360"/>
+      </w:pPr>
+    </w:lvl>
+  </w:abstractNum>
+  <w:abstractNum w:abstractNumId="8" w15:restartNumberingAfterBreak="0">
     <w:nsid w:val="659A1442"/>
     <w:multiLevelType w:val="multilevel"/>
     <w:tmpl w:val="D67AA304"/>
@@ -2797,7 +3877,156 @@
       </w:rPr>
     </w:lvl>
   </w:abstractNum>
-  <w:abstractNum w:abstractNumId="7" w15:restartNumberingAfterBreak="0">
+  <w:abstractNum w:abstractNumId="9" w15:restartNumberingAfterBreak="0">
+    <w:nsid w:val="6AA16A8B"/>
+    <w:multiLevelType w:val="multilevel"/>
+    <w:tmpl w:val="39BA153C"/>
+    <w:lvl w:ilvl="0">
+      <w:start w:val="1"/>
+      <w:numFmt w:val="bullet"/>
+      <w:lvlText w:val=""/>
+      <w:lvlJc w:val="left"/>
+      <w:pPr>
+        <w:tabs>
+          <w:tab w:val="num" w:pos="720"/>
+        </w:tabs>
+        <w:ind w:left="720" w:hanging="360"/>
+      </w:pPr>
+      <w:rPr>
+        <w:rFonts w:ascii="Symbol" w:hAnsi="Symbol" w:hint="default"/>
+        <w:sz w:val="20"/>
+      </w:rPr>
+    </w:lvl>
+    <w:lvl w:ilvl="1" w:tentative="1">
+      <w:start w:val="1"/>
+      <w:numFmt w:val="bullet"/>
+      <w:lvlText w:val="o"/>
+      <w:lvlJc w:val="left"/>
+      <w:pPr>
+        <w:tabs>
+          <w:tab w:val="num" w:pos="1440"/>
+        </w:tabs>
+        <w:ind w:left="1440" w:hanging="360"/>
+      </w:pPr>
+      <w:rPr>
+        <w:rFonts w:ascii="Courier New" w:hAnsi="Courier New" w:hint="default"/>
+        <w:sz w:val="20"/>
+      </w:rPr>
+    </w:lvl>
+    <w:lvl w:ilvl="2" w:tentative="1">
+      <w:start w:val="1"/>
+      <w:numFmt w:val="bullet"/>
+      <w:lvlText w:val=""/>
+      <w:lvlJc w:val="left"/>
+      <w:pPr>
+        <w:tabs>
+          <w:tab w:val="num" w:pos="2160"/>
+        </w:tabs>
+        <w:ind w:left="2160" w:hanging="360"/>
+      </w:pPr>
+      <w:rPr>
+        <w:rFonts w:ascii="Wingdings" w:hAnsi="Wingdings" w:hint="default"/>
+        <w:sz w:val="20"/>
+      </w:rPr>
+    </w:lvl>
+    <w:lvl w:ilvl="3" w:tentative="1">
+      <w:start w:val="1"/>
+      <w:numFmt w:val="bullet"/>
+      <w:lvlText w:val=""/>
+      <w:lvlJc w:val="left"/>
+      <w:pPr>
+        <w:tabs>
+          <w:tab w:val="num" w:pos="2880"/>
+        </w:tabs>
+        <w:ind w:left="2880" w:hanging="360"/>
+      </w:pPr>
+      <w:rPr>
+        <w:rFonts w:ascii="Wingdings" w:hAnsi="Wingdings" w:hint="default"/>
+        <w:sz w:val="20"/>
+      </w:rPr>
+    </w:lvl>
+    <w:lvl w:ilvl="4" w:tentative="1">
+      <w:start w:val="1"/>
+      <w:numFmt w:val="bullet"/>
+      <w:lvlText w:val=""/>
+      <w:lvlJc w:val="left"/>
+      <w:pPr>
+        <w:tabs>
+          <w:tab w:val="num" w:pos="3600"/>
+        </w:tabs>
+        <w:ind w:left="3600" w:hanging="360"/>
+      </w:pPr>
+      <w:rPr>
+        <w:rFonts w:ascii="Wingdings" w:hAnsi="Wingdings" w:hint="default"/>
+        <w:sz w:val="20"/>
+      </w:rPr>
+    </w:lvl>
+    <w:lvl w:ilvl="5" w:tentative="1">
+      <w:start w:val="1"/>
+      <w:numFmt w:val="bullet"/>
+      <w:lvlText w:val=""/>
+      <w:lvlJc w:val="left"/>
+      <w:pPr>
+        <w:tabs>
+          <w:tab w:val="num" w:pos="4320"/>
+        </w:tabs>
+        <w:ind w:left="4320" w:hanging="360"/>
+      </w:pPr>
+      <w:rPr>
+        <w:rFonts w:ascii="Wingdings" w:hAnsi="Wingdings" w:hint="default"/>
+        <w:sz w:val="20"/>
+      </w:rPr>
+    </w:lvl>
+    <w:lvl w:ilvl="6" w:tentative="1">
+      <w:start w:val="1"/>
+      <w:numFmt w:val="bullet"/>
+      <w:lvlText w:val=""/>
+      <w:lvlJc w:val="left"/>
+      <w:pPr>
+        <w:tabs>
+          <w:tab w:val="num" w:pos="5040"/>
+        </w:tabs>
+        <w:ind w:left="5040" w:hanging="360"/>
+      </w:pPr>
+      <w:rPr>
+        <w:rFonts w:ascii="Wingdings" w:hAnsi="Wingdings" w:hint="default"/>
+        <w:sz w:val="20"/>
+      </w:rPr>
+    </w:lvl>
+    <w:lvl w:ilvl="7" w:tentative="1">
+      <w:start w:val="1"/>
+      <w:numFmt w:val="bullet"/>
+      <w:lvlText w:val=""/>
+      <w:lvlJc w:val="left"/>
+      <w:pPr>
+        <w:tabs>
+          <w:tab w:val="num" w:pos="5760"/>
+        </w:tabs>
+        <w:ind w:left="5760" w:hanging="360"/>
+      </w:pPr>
+      <w:rPr>
+        <w:rFonts w:ascii="Wingdings" w:hAnsi="Wingdings" w:hint="default"/>
+        <w:sz w:val="20"/>
+      </w:rPr>
+    </w:lvl>
+    <w:lvl w:ilvl="8" w:tentative="1">
+      <w:start w:val="1"/>
+      <w:numFmt w:val="bullet"/>
+      <w:lvlText w:val=""/>
+      <w:lvlJc w:val="left"/>
+      <w:pPr>
+        <w:tabs>
+          <w:tab w:val="num" w:pos="6480"/>
+        </w:tabs>
+        <w:ind w:left="6480" w:hanging="360"/>
+      </w:pPr>
+      <w:rPr>
+        <w:rFonts w:ascii="Wingdings" w:hAnsi="Wingdings" w:hint="default"/>
+        <w:sz w:val="20"/>
+      </w:rPr>
+    </w:lvl>
+  </w:abstractNum>
+  <w:abstractNum w:abstractNumId="10" w15:restartNumberingAfterBreak="0">
     <w:nsid w:val="77DE4903"/>
     <w:multiLevelType w:val="multilevel"/>
     <w:tmpl w:val="9DCAC972"/>
@@ -2950,25 +4179,25 @@
     <w:abstractNumId w:val="0"/>
   </w:num>
   <w:num w:numId="2" w16cid:durableId="479157867">
-    <w:abstractNumId w:val="6"/>
+    <w:abstractNumId w:val="8"/>
   </w:num>
   <w:num w:numId="3" w16cid:durableId="543060929">
     <w:abstractNumId w:val="1"/>
   </w:num>
   <w:num w:numId="4" w16cid:durableId="1690140193">
+    <w:abstractNumId w:val="4"/>
+  </w:num>
+  <w:num w:numId="5" w16cid:durableId="2168010">
     <w:abstractNumId w:val="3"/>
   </w:num>
-  <w:num w:numId="5" w16cid:durableId="2168010">
-    <w:abstractNumId w:val="2"/>
-  </w:num>
   <w:num w:numId="6" w16cid:durableId="86195363">
-    <w:abstractNumId w:val="4"/>
+    <w:abstractNumId w:val="5"/>
   </w:num>
   <w:num w:numId="7" w16cid:durableId="1326124108">
-    <w:abstractNumId w:val="7"/>
+    <w:abstractNumId w:val="10"/>
   </w:num>
   <w:num w:numId="8" w16cid:durableId="36394249">
-    <w:abstractNumId w:val="7"/>
+    <w:abstractNumId w:val="10"/>
     <w:lvlOverride w:ilvl="1">
       <w:lvl w:ilvl="1">
         <w:numFmt w:val="decimal"/>
@@ -2978,7 +4207,16 @@
     </w:lvlOverride>
   </w:num>
   <w:num w:numId="9" w16cid:durableId="1296718153">
-    <w:abstractNumId w:val="5"/>
+    <w:abstractNumId w:val="6"/>
+  </w:num>
+  <w:num w:numId="10" w16cid:durableId="871113905">
+    <w:abstractNumId w:val="7"/>
+  </w:num>
+  <w:num w:numId="11" w16cid:durableId="1374961554">
+    <w:abstractNumId w:val="2"/>
+  </w:num>
+  <w:num w:numId="12" w16cid:durableId="2106681612">
+    <w:abstractNumId w:val="9"/>
   </w:num>
 </w:numbering>
 </file>

</xml_diff>